<commit_message>
added invoice/sales dashboard, added meta server c_api
</commit_message>
<xml_diff>
--- a/src/app/api/getinv/invoice-final-no-loop.docx
+++ b/src/app/api/getinv/invoice-final-no-loop.docx
@@ -1,6 +1,6 @@
 
 <file path=word/document.xml><?xml version="1.0" encoding="utf-8"?>
-<w:document xmlns:wpc="http://schemas.microsoft.com/office/word/2010/wordprocessingCanvas" xmlns:cx="http://schemas.microsoft.com/office/drawing/2014/chartex" xmlns:cx1="http://schemas.microsoft.com/office/drawing/2015/9/8/chartex" xmlns:cx2="http://schemas.microsoft.com/office/drawing/2015/10/21/chartex" xmlns:cx3="http://schemas.microsoft.com/office/drawing/2016/5/9/chartex" xmlns:cx4="http://schemas.microsoft.com/office/drawing/2016/5/10/chartex" xmlns:cx5="http://schemas.microsoft.com/office/drawing/2016/5/11/chartex" xmlns:cx6="http://schemas.microsoft.com/office/drawing/2016/5/12/chartex" xmlns:cx7="http://schemas.microsoft.com/office/drawing/2016/5/13/chartex" xmlns:cx8="http://schemas.microsoft.com/office/drawing/2016/5/14/chartex" xmlns:mc="http://schemas.openxmlformats.org/markup-compatibility/2006" xmlns:aink="http://schemas.microsoft.com/office/drawing/2016/ink" xmlns:am3d="http://schemas.microsoft.com/office/drawing/2017/model3d" xmlns:o="urn:schemas-microsoft-com:office:office" xmlns:r="http://schemas.openxmlformats.org/officeDocument/2006/relationships" xmlns:m="http://schemas.openxmlformats.org/officeDocument/2006/math" xmlns:v="urn:schemas-microsoft-com:vml" xmlns:wp14="http://schemas.microsoft.com/office/word/2010/wordprocessingDrawing" xmlns:wp="http://schemas.openxmlformats.org/drawingml/2006/wordprocessingDrawing" xmlns:w10="urn:schemas-microsoft-com:office:word" xmlns:w="http://schemas.openxmlformats.org/wordprocessingml/2006/main" xmlns:w14="http://schemas.microsoft.com/office/word/2010/wordml" xmlns:w15="http://schemas.microsoft.com/office/word/2012/wordml" xmlns:w16cex="http://schemas.microsoft.com/office/word/2018/wordml/cex" xmlns:w16cid="http://schemas.microsoft.com/office/word/2016/wordml/cid" xmlns:w16="http://schemas.microsoft.com/office/word/2018/wordml" xmlns:w16sdtdh="http://schemas.microsoft.com/office/word/2020/wordml/sdtdatahash" xmlns:w16se="http://schemas.microsoft.com/office/word/2015/wordml/symex" xmlns:wpg="http://schemas.microsoft.com/office/word/2010/wordprocessingGroup" xmlns:wpi="http://schemas.microsoft.com/office/word/2010/wordprocessingInk" xmlns:wne="http://schemas.microsoft.com/office/word/2006/wordml" xmlns:wps="http://schemas.microsoft.com/office/word/2010/wordprocessingShape" mc:Ignorable="w14 w15 w16se w16cid w16 w16cex w16sdtdh wp14">
+<w:document xmlns:wpc="http://schemas.microsoft.com/office/word/2010/wordprocessingCanvas" xmlns:cx="http://schemas.microsoft.com/office/drawing/2014/chartex" xmlns:cx1="http://schemas.microsoft.com/office/drawing/2015/9/8/chartex" xmlns:cx2="http://schemas.microsoft.com/office/drawing/2015/10/21/chartex" xmlns:cx3="http://schemas.microsoft.com/office/drawing/2016/5/9/chartex" xmlns:cx4="http://schemas.microsoft.com/office/drawing/2016/5/10/chartex" xmlns:cx5="http://schemas.microsoft.com/office/drawing/2016/5/11/chartex" xmlns:cx6="http://schemas.microsoft.com/office/drawing/2016/5/12/chartex" xmlns:cx7="http://schemas.microsoft.com/office/drawing/2016/5/13/chartex" xmlns:cx8="http://schemas.microsoft.com/office/drawing/2016/5/14/chartex" xmlns:mc="http://schemas.openxmlformats.org/markup-compatibility/2006" xmlns:aink="http://schemas.microsoft.com/office/drawing/2016/ink" xmlns:am3d="http://schemas.microsoft.com/office/drawing/2017/model3d" xmlns:o="urn:schemas-microsoft-com:office:office" xmlns:oel="http://schemas.microsoft.com/office/2019/extlst" xmlns:r="http://schemas.openxmlformats.org/officeDocument/2006/relationships" xmlns:m="http://schemas.openxmlformats.org/officeDocument/2006/math" xmlns:v="urn:schemas-microsoft-com:vml" xmlns:wp14="http://schemas.microsoft.com/office/word/2010/wordprocessingDrawing" xmlns:wp="http://schemas.openxmlformats.org/drawingml/2006/wordprocessingDrawing" xmlns:w10="urn:schemas-microsoft-com:office:word" xmlns:w="http://schemas.openxmlformats.org/wordprocessingml/2006/main" xmlns:w14="http://schemas.microsoft.com/office/word/2010/wordml" xmlns:w15="http://schemas.microsoft.com/office/word/2012/wordml" xmlns:w16cex="http://schemas.microsoft.com/office/word/2018/wordml/cex" xmlns:w16cid="http://schemas.microsoft.com/office/word/2016/wordml/cid" xmlns:w16="http://schemas.microsoft.com/office/word/2018/wordml" xmlns:w16du="http://schemas.microsoft.com/office/word/2023/wordml/word16du" xmlns:w16sdtdh="http://schemas.microsoft.com/office/word/2020/wordml/sdtdatahash" xmlns:w16sdtfl="http://schemas.microsoft.com/office/word/2024/wordml/sdtformatlock" xmlns:w16se="http://schemas.microsoft.com/office/word/2015/wordml/symex" xmlns:wpg="http://schemas.microsoft.com/office/word/2010/wordprocessingGroup" xmlns:wpi="http://schemas.microsoft.com/office/word/2010/wordprocessingInk" xmlns:wne="http://schemas.microsoft.com/office/word/2006/wordml" xmlns:wps="http://schemas.microsoft.com/office/word/2010/wordprocessingShape" mc:Ignorable="w14 w15 w16se w16cid w16 w16cex w16sdtdh w16sdtfl w16du wp14">
   <w:body>
     <w:tbl>
       <w:tblPr>
@@ -209,13 +209,14 @@
               <w:ind w:left="38"/>
               <w:rPr>
                 <w:sz w:val="20"/>
-              </w:rPr>
-            </w:pPr>
-            <w:r>
-              <w:rPr>
-                <w:sz w:val="20"/>
                 <w:szCs w:val="20"/>
               </w:rPr>
+            </w:pPr>
+            <w:r>
+              <w:rPr>
+                <w:sz w:val="20"/>
+                <w:szCs w:val="20"/>
+              </w:rPr>
               <w:t>(Proprietor: Aakash Vinodbhai Gohil)</w:t>
             </w:r>
             <w:r>
@@ -224,14 +225,32 @@
                 <w:szCs w:val="20"/>
               </w:rPr>
               <w:br/>
-              <w:t>GSTIN: gstdemo-12345</w:t>
-            </w:r>
-            <w:r>
-              <w:rPr>
+              <w:t xml:space="preserve">GSTIN: </w:t>
+            </w:r>
+            <w:r>
+              <w:rPr>
+                <w:b/>
+                <w:bCs/>
                 <w:sz w:val="20"/>
                 <w:szCs w:val="20"/>
               </w:rPr>
-              <w:br/>
+              <w:t>24BYWPV0419D1Z7</w:t>
+            </w:r>
+          </w:p>
+          <w:p>
+            <w:pPr>
+              <w:pStyle w:val="TableParagraph"/>
+              <w:spacing w:before="29" w:line="360" w:lineRule="auto"/>
+              <w:ind w:left="38"/>
+              <w:rPr>
+                <w:sz w:val="20"/>
+              </w:rPr>
+            </w:pPr>
+            <w:r>
+              <w:rPr>
+                <w:sz w:val="20"/>
+                <w:szCs w:val="20"/>
+              </w:rPr>
               <w:t>Address: 101, Vadvala Society, Satyanarayan Road, Surat, Gujarat – 395006, India</w:t>
             </w:r>
           </w:p>
@@ -356,7 +375,6 @@
               </w:rPr>
               <w:t xml:space="preserve"> </w:t>
             </w:r>
-            <w:proofErr w:type="gramStart"/>
             <w:r>
               <w:rPr>
                 <w:sz w:val="20"/>
@@ -376,7 +394,6 @@
               </w:rPr>
               <w:t>:</w:t>
             </w:r>
-            <w:proofErr w:type="gramEnd"/>
             <w:r>
               <w:rPr>
                 <w:spacing w:val="71"/>
@@ -619,7 +636,6 @@
                 <w:sz w:val="18"/>
               </w:rPr>
             </w:pPr>
-            <w:proofErr w:type="gramStart"/>
             <w:r>
               <w:rPr>
                 <w:spacing w:val="-4"/>
@@ -634,13 +650,19 @@
               </w:rPr>
               <w:t>(</w:t>
             </w:r>
-            <w:proofErr w:type="gramEnd"/>
             <w:r>
               <w:rPr>
                 <w:spacing w:val="-4"/>
                 <w:sz w:val="18"/>
               </w:rPr>
-              <w:t>USD)</w:t>
+              <w:t>{{CRNC}}</w:t>
+            </w:r>
+            <w:r>
+              <w:rPr>
+                <w:spacing w:val="-4"/>
+                <w:sz w:val="18"/>
+              </w:rPr>
+              <w:t>)</w:t>
             </w:r>
           </w:p>
         </w:tc>
@@ -658,7 +680,6 @@
                 <w:sz w:val="18"/>
               </w:rPr>
             </w:pPr>
-            <w:proofErr w:type="gramStart"/>
             <w:r>
               <w:rPr>
                 <w:spacing w:val="-5"/>
@@ -666,13 +687,12 @@
               </w:rPr>
               <w:t>Amount(</w:t>
             </w:r>
-            <w:proofErr w:type="gramEnd"/>
             <w:r>
               <w:rPr>
                 <w:spacing w:val="-5"/>
                 <w:sz w:val="18"/>
               </w:rPr>
-              <w:t>USD</w:t>
+              <w:t>{{CRNC}}</w:t>
             </w:r>
             <w:r>
               <w:rPr>
@@ -1180,7 +1200,6 @@
               </w:rPr>
               <w:t xml:space="preserve"> </w:t>
             </w:r>
-            <w:proofErr w:type="gramStart"/>
             <w:r>
               <w:rPr>
                 <w:rFonts w:ascii="Arial"/>
@@ -1208,7 +1227,6 @@
               </w:rPr>
               <w:t>:</w:t>
             </w:r>
-            <w:proofErr w:type="gramEnd"/>
           </w:p>
           <w:p>
             <w:pPr>
@@ -1299,33 +1317,7 @@
               <w:rPr>
                 <w:sz w:val="16"/>
               </w:rPr>
-              <w:t xml:space="preserve">USD NINETEEN </w:t>
-            </w:r>
-            <w:proofErr w:type="gramStart"/>
-            <w:r>
-              <w:rPr>
-                <w:sz w:val="16"/>
-              </w:rPr>
-              <w:t>ONLY</w:t>
-            </w:r>
-            <w:r>
-              <w:rPr>
-                <w:sz w:val="16"/>
-              </w:rPr>
-              <w:t xml:space="preserve">  </w:t>
-            </w:r>
-            <w:r>
-              <w:rPr>
-                <w:sz w:val="16"/>
-              </w:rPr>
-              <w:t>{</w:t>
-            </w:r>
-            <w:proofErr w:type="gramEnd"/>
-            <w:r>
-              <w:rPr>
-                <w:sz w:val="16"/>
-              </w:rPr>
-              <w:t>{TOTAL_TEXT}}</w:t>
+              <w:t>{{TOTAL_TEXT}}</w:t>
             </w:r>
           </w:p>
         </w:tc>
@@ -1367,7 +1359,21 @@
                 <w:position w:val="2"/>
                 <w:sz w:val="20"/>
               </w:rPr>
-              <w:t>{{CURRENCY}}</w:t>
+              <w:t>{{C</w:t>
+            </w:r>
+            <w:r>
+              <w:rPr>
+                <w:position w:val="2"/>
+                <w:sz w:val="20"/>
+              </w:rPr>
+              <w:t>RNC</w:t>
+            </w:r>
+            <w:r>
+              <w:rPr>
+                <w:position w:val="2"/>
+                <w:sz w:val="20"/>
+              </w:rPr>
+              <w:t>}}</w:t>
             </w:r>
             <w:r>
               <w:rPr>
@@ -1459,7 +1465,25 @@
                 <w:spacing w:val="-2"/>
                 <w:sz w:val="16"/>
               </w:rPr>
-              <w:t xml:space="preserve">Place of Supply: United States  </w:t>
+              <w:t xml:space="preserve">Place of Supply: </w:t>
+            </w:r>
+            <w:r>
+              <w:rPr>
+                <w:rFonts w:ascii="Arial"/>
+                <w:bCs/>
+                <w:spacing w:val="-2"/>
+                <w:sz w:val="16"/>
+              </w:rPr>
+              <w:t>{{COUNTRY}}</w:t>
+            </w:r>
+            <w:r>
+              <w:rPr>
+                <w:rFonts w:ascii="Arial"/>
+                <w:bCs/>
+                <w:spacing w:val="-2"/>
+                <w:sz w:val="16"/>
+              </w:rPr>
+              <w:t xml:space="preserve">  </w:t>
             </w:r>
           </w:p>
           <w:p>
@@ -1548,7 +1572,6 @@
                 <w:sz w:val="20"/>
               </w:rPr>
             </w:pPr>
-            <w:proofErr w:type="gramStart"/>
             <w:r>
               <w:rPr>
                 <w:position w:val="-10"/>
@@ -1556,7 +1579,6 @@
               </w:rPr>
               <w:t>Authorized  Signatory</w:t>
             </w:r>
-            <w:proofErr w:type="gramEnd"/>
           </w:p>
         </w:tc>
       </w:tr>
@@ -1573,7 +1595,7 @@
 </file>
 
 <file path=word/styles.xml><?xml version="1.0" encoding="utf-8"?>
-<w:styles xmlns:mc="http://schemas.openxmlformats.org/markup-compatibility/2006" xmlns:r="http://schemas.openxmlformats.org/officeDocument/2006/relationships" xmlns:w="http://schemas.openxmlformats.org/wordprocessingml/2006/main" xmlns:w14="http://schemas.microsoft.com/office/word/2010/wordml" xmlns:w15="http://schemas.microsoft.com/office/word/2012/wordml" xmlns:w16cex="http://schemas.microsoft.com/office/word/2018/wordml/cex" xmlns:w16cid="http://schemas.microsoft.com/office/word/2016/wordml/cid" xmlns:w16="http://schemas.microsoft.com/office/word/2018/wordml" xmlns:w16sdtdh="http://schemas.microsoft.com/office/word/2020/wordml/sdtdatahash" xmlns:w16se="http://schemas.microsoft.com/office/word/2015/wordml/symex" mc:Ignorable="w14 w15 w16se w16cid w16 w16cex w16sdtdh">
+<w:styles xmlns:mc="http://schemas.openxmlformats.org/markup-compatibility/2006" xmlns:r="http://schemas.openxmlformats.org/officeDocument/2006/relationships" xmlns:w="http://schemas.openxmlformats.org/wordprocessingml/2006/main" xmlns:w14="http://schemas.microsoft.com/office/word/2010/wordml" xmlns:w15="http://schemas.microsoft.com/office/word/2012/wordml" xmlns:w16cex="http://schemas.microsoft.com/office/word/2018/wordml/cex" xmlns:w16cid="http://schemas.microsoft.com/office/word/2016/wordml/cid" xmlns:w16="http://schemas.microsoft.com/office/word/2018/wordml" xmlns:w16du="http://schemas.microsoft.com/office/word/2023/wordml/word16du" xmlns:w16sdtdh="http://schemas.microsoft.com/office/word/2020/wordml/sdtdatahash" xmlns:w16sdtfl="http://schemas.microsoft.com/office/word/2024/wordml/sdtformatlock" xmlns:w16se="http://schemas.microsoft.com/office/word/2015/wordml/symex" mc:Ignorable="w14 w15 w16se w16cid w16 w16cex w16sdtdh w16sdtfl w16du">
   <w:docDefaults>
     <w:rPrDefault>
       <w:rPr>

</xml_diff>